<commit_message>
final changes before push
</commit_message>
<xml_diff>
--- a/AI Medical Document Copilot.docx
+++ b/AI Medical Document Copilot.docx
@@ -366,8 +366,8 @@
     </w:p>
     <w:p>
       <w:r>
-        <w:pict w14:anchorId="07237832">
-          <v:rect id="_x0000_i1301" style="width:0;height:1.5pt" o:hralign="center" o:hrstd="t" o:hr="t" fillcolor="#a0a0a0" stroked="f"/>
+        <w:pict w14:anchorId="0B13534F">
+          <v:rect id="_x0000_i1025" style="width:0;height:1.5pt" o:hralign="center" o:hrstd="t" o:hr="t" fillcolor="#a0a0a0" stroked="f"/>
         </w:pict>
       </w:r>
     </w:p>
@@ -509,8 +509,8 @@
     </w:p>
     <w:p>
       <w:r>
-        <w:pict w14:anchorId="76C6C152">
-          <v:rect id="_x0000_i1302" style="width:0;height:1.5pt" o:hralign="center" o:hrstd="t" o:hr="t" fillcolor="#a0a0a0" stroked="f"/>
+        <w:pict w14:anchorId="0B135350">
+          <v:rect id="_x0000_i1026" style="width:0;height:1.5pt" o:hralign="center" o:hrstd="t" o:hr="t" fillcolor="#a0a0a0" stroked="f"/>
         </w:pict>
       </w:r>
     </w:p>
@@ -597,8 +597,8 @@
     </w:p>
     <w:p>
       <w:r>
-        <w:pict w14:anchorId="41F3589B">
-          <v:rect id="_x0000_i1303" style="width:0;height:1.5pt" o:hralign="center" o:hrstd="t" o:hr="t" fillcolor="#a0a0a0" stroked="f"/>
+        <w:pict w14:anchorId="0B135351">
+          <v:rect id="_x0000_i1027" style="width:0;height:1.5pt" o:hralign="center" o:hrstd="t" o:hr="t" fillcolor="#a0a0a0" stroked="f"/>
         </w:pict>
       </w:r>
     </w:p>
@@ -665,8 +665,8 @@
     </w:p>
     <w:p>
       <w:r>
-        <w:pict w14:anchorId="2F9B08DA">
-          <v:rect id="_x0000_i1304" style="width:0;height:1.5pt" o:hralign="center" o:hrstd="t" o:hr="t" fillcolor="#a0a0a0" stroked="f"/>
+        <w:pict w14:anchorId="0B135352">
+          <v:rect id="_x0000_i1028" style="width:0;height:1.5pt" o:hralign="center" o:hrstd="t" o:hr="t" fillcolor="#a0a0a0" stroked="f"/>
         </w:pict>
       </w:r>
     </w:p>
@@ -720,8 +720,8 @@
     </w:p>
     <w:p>
       <w:r>
-        <w:pict w14:anchorId="69AF652A">
-          <v:rect id="_x0000_i1305" style="width:0;height:1.5pt" o:hralign="center" o:hrstd="t" o:hr="t" fillcolor="#a0a0a0" stroked="f"/>
+        <w:pict w14:anchorId="0B135353">
+          <v:rect id="_x0000_i1029" style="width:0;height:1.5pt" o:hralign="center" o:hrstd="t" o:hr="t" fillcolor="#a0a0a0" stroked="f"/>
         </w:pict>
       </w:r>
     </w:p>
@@ -841,8 +841,8 @@
     </w:p>
     <w:p>
       <w:r>
-        <w:pict w14:anchorId="08C8F186">
-          <v:rect id="_x0000_i1306" style="width:0;height:1.5pt" o:hralign="center" o:hrstd="t" o:hr="t" fillcolor="#a0a0a0" stroked="f"/>
+        <w:pict w14:anchorId="0B135354">
+          <v:rect id="_x0000_i1030" style="width:0;height:1.5pt" o:hralign="center" o:hrstd="t" o:hr="t" fillcolor="#a0a0a0" stroked="f"/>
         </w:pict>
       </w:r>
     </w:p>
@@ -883,8 +883,8 @@
     <w:p>
       <w:r>
         <w:lastRenderedPageBreak/>
-        <w:pict w14:anchorId="1FE65F6C">
-          <v:rect id="_x0000_i1307" style="width:0;height:1.5pt" o:hralign="center" o:hrstd="t" o:hr="t" fillcolor="#a0a0a0" stroked="f"/>
+        <w:pict w14:anchorId="0B135355">
+          <v:rect id="_x0000_i1031" style="width:0;height:1.5pt" o:hralign="center" o:hrstd="t" o:hr="t" fillcolor="#a0a0a0" stroked="f"/>
         </w:pict>
       </w:r>
     </w:p>
@@ -958,8 +958,8 @@
     </w:p>
     <w:p>
       <w:r>
-        <w:pict w14:anchorId="63E77F7C">
-          <v:rect id="_x0000_i1308" style="width:0;height:1.5pt" o:hralign="center" o:hrstd="t" o:hr="t" fillcolor="#a0a0a0" stroked="f"/>
+        <w:pict w14:anchorId="0B135356">
+          <v:rect id="_x0000_i1032" style="width:0;height:1.5pt" o:hralign="center" o:hrstd="t" o:hr="t" fillcolor="#a0a0a0" stroked="f"/>
         </w:pict>
       </w:r>
     </w:p>
@@ -1010,8 +1010,8 @@
     </w:p>
     <w:p>
       <w:r>
-        <w:pict w14:anchorId="43129C4D">
-          <v:rect id="_x0000_i1309" style="width:0;height:1.5pt" o:hralign="center" o:hrstd="t" o:hr="t" fillcolor="#a0a0a0" stroked="f"/>
+        <w:pict w14:anchorId="0B135357">
+          <v:rect id="_x0000_i1033" style="width:0;height:1.5pt" o:hralign="center" o:hrstd="t" o:hr="t" fillcolor="#a0a0a0" stroked="f"/>
         </w:pict>
       </w:r>
     </w:p>
@@ -1062,8 +1062,8 @@
     </w:p>
     <w:p>
       <w:r>
-        <w:pict w14:anchorId="3C031129">
-          <v:rect id="_x0000_i1310" style="width:0;height:1.5pt" o:hralign="center" o:hrstd="t" o:hr="t" fillcolor="#a0a0a0" stroked="f"/>
+        <w:pict w14:anchorId="0B135358">
+          <v:rect id="_x0000_i1034" style="width:0;height:1.5pt" o:hralign="center" o:hrstd="t" o:hr="t" fillcolor="#a0a0a0" stroked="f"/>
         </w:pict>
       </w:r>
     </w:p>
@@ -1114,8 +1114,8 @@
     </w:p>
     <w:p>
       <w:r>
-        <w:pict w14:anchorId="5CB62DE8">
-          <v:rect id="_x0000_i1311" style="width:0;height:1.5pt" o:hralign="center" o:hrstd="t" o:hr="t" fillcolor="#a0a0a0" stroked="f"/>
+        <w:pict w14:anchorId="0B135359">
+          <v:rect id="_x0000_i1035" style="width:0;height:1.5pt" o:hralign="center" o:hrstd="t" o:hr="t" fillcolor="#a0a0a0" stroked="f"/>
         </w:pict>
       </w:r>
     </w:p>
@@ -1420,8 +1420,8 @@
     </w:p>
     <w:p>
       <w:r>
-        <w:pict w14:anchorId="540BF938">
-          <v:rect id="_x0000_i1312" style="width:0;height:1.5pt" o:hralign="center" o:hrstd="t" o:hr="t" fillcolor="#a0a0a0" stroked="f"/>
+        <w:pict w14:anchorId="0B13535A">
+          <v:rect id="_x0000_i1036" style="width:0;height:1.5pt" o:hralign="center" o:hrstd="t" o:hr="t" fillcolor="#a0a0a0" stroked="f"/>
         </w:pict>
       </w:r>
     </w:p>
@@ -1557,8 +1557,8 @@
     </w:p>
     <w:p>
       <w:r>
-        <w:pict w14:anchorId="6A64AE4F">
-          <v:rect id="_x0000_i1313" style="width:0;height:1.5pt" o:hralign="center" o:hrstd="t" o:hr="t" fillcolor="#a0a0a0" stroked="f"/>
+        <w:pict w14:anchorId="0B13535B">
+          <v:rect id="_x0000_i1037" style="width:0;height:1.5pt" o:hralign="center" o:hrstd="t" o:hr="t" fillcolor="#a0a0a0" stroked="f"/>
         </w:pict>
       </w:r>
     </w:p>
@@ -1612,8 +1612,8 @@
     </w:p>
     <w:p>
       <w:r>
-        <w:pict w14:anchorId="33800C27">
-          <v:rect id="_x0000_i1314" style="width:0;height:1.5pt" o:hralign="center" o:hrstd="t" o:hr="t" fillcolor="#a0a0a0" stroked="f"/>
+        <w:pict w14:anchorId="0B13535C">
+          <v:rect id="_x0000_i1038" style="width:0;height:1.5pt" o:hralign="center" o:hrstd="t" o:hr="t" fillcolor="#a0a0a0" stroked="f"/>
         </w:pict>
       </w:r>
     </w:p>
@@ -1754,8 +1754,8 @@
     </w:p>
     <w:p>
       <w:r>
-        <w:pict w14:anchorId="525F0CE2">
-          <v:rect id="_x0000_i1315" style="width:0;height:1.5pt" o:hralign="center" o:hrstd="t" o:hr="t" fillcolor="#a0a0a0" stroked="f"/>
+        <w:pict w14:anchorId="0B13535D">
+          <v:rect id="_x0000_i1039" style="width:0;height:1.5pt" o:hralign="center" o:hrstd="t" o:hr="t" fillcolor="#a0a0a0" stroked="f"/>
         </w:pict>
       </w:r>
     </w:p>
@@ -1800,8 +1800,8 @@
     </w:p>
     <w:p>
       <w:r>
-        <w:pict w14:anchorId="237E1657">
-          <v:rect id="_x0000_i1316" style="width:0;height:1.5pt" o:hralign="center" o:hrstd="t" o:hr="t" fillcolor="#a0a0a0" stroked="f"/>
+        <w:pict w14:anchorId="0B13535E">
+          <v:rect id="_x0000_i1040" style="width:0;height:1.5pt" o:hralign="center" o:hrstd="t" o:hr="t" fillcolor="#a0a0a0" stroked="f"/>
         </w:pict>
       </w:r>
     </w:p>
@@ -1840,8 +1840,8 @@
     </w:p>
     <w:p>
       <w:r>
-        <w:pict w14:anchorId="372BD216">
-          <v:rect id="_x0000_i1317" style="width:0;height:1.5pt" o:hralign="center" o:hrstd="t" o:hr="t" fillcolor="#a0a0a0" stroked="f"/>
+        <w:pict w14:anchorId="0B13535F">
+          <v:rect id="_x0000_i1041" style="width:0;height:1.5pt" o:hralign="center" o:hrstd="t" o:hr="t" fillcolor="#a0a0a0" stroked="f"/>
         </w:pict>
       </w:r>
     </w:p>
@@ -1904,8 +1904,8 @@
     </w:p>
     <w:p>
       <w:r>
-        <w:pict w14:anchorId="27275E99">
-          <v:rect id="_x0000_i1318" style="width:0;height:1.5pt" o:hralign="center" o:hrstd="t" o:hr="t" fillcolor="#a0a0a0" stroked="f"/>
+        <w:pict w14:anchorId="0B135360">
+          <v:rect id="_x0000_i1042" style="width:0;height:1.5pt" o:hralign="center" o:hrstd="t" o:hr="t" fillcolor="#a0a0a0" stroked="f"/>
         </w:pict>
       </w:r>
     </w:p>
@@ -2013,8 +2013,8 @@
     </w:p>
     <w:p>
       <w:r>
-        <w:pict w14:anchorId="2C64EDCC">
-          <v:rect id="_x0000_i1319" style="width:0;height:1.5pt" o:hralign="center" o:hrstd="t" o:hr="t" fillcolor="#a0a0a0" stroked="f"/>
+        <w:pict w14:anchorId="0B135361">
+          <v:rect id="_x0000_i1043" style="width:0;height:1.5pt" o:hralign="center" o:hrstd="t" o:hr="t" fillcolor="#a0a0a0" stroked="f"/>
         </w:pict>
       </w:r>
     </w:p>
@@ -2138,8 +2138,8 @@
     </w:p>
     <w:p>
       <w:r>
-        <w:pict w14:anchorId="37037943">
-          <v:rect id="_x0000_i1320" style="width:0;height:1.5pt" o:hralign="center" o:hrstd="t" o:hr="t" fillcolor="#a0a0a0" stroked="f"/>
+        <w:pict w14:anchorId="0B135362">
+          <v:rect id="_x0000_i1044" style="width:0;height:1.5pt" o:hralign="center" o:hrstd="t" o:hr="t" fillcolor="#a0a0a0" stroked="f"/>
         </w:pict>
       </w:r>
     </w:p>
@@ -2225,8 +2225,8 @@
     </w:p>
     <w:p>
       <w:r>
-        <w:pict w14:anchorId="1B4FC420">
-          <v:rect id="_x0000_i1321" style="width:0;height:1.5pt" o:hralign="center" o:hrstd="t" o:hr="t" fillcolor="#a0a0a0" stroked="f"/>
+        <w:pict w14:anchorId="0B135363">
+          <v:rect id="_x0000_i1045" style="width:0;height:1.5pt" o:hralign="center" o:hrstd="t" o:hr="t" fillcolor="#a0a0a0" stroked="f"/>
         </w:pict>
       </w:r>
     </w:p>
@@ -2360,8 +2360,8 @@
     </w:p>
     <w:p>
       <w:r>
-        <w:pict w14:anchorId="5E23CFB9">
-          <v:rect id="_x0000_i1322" style="width:0;height:1.5pt" o:hralign="center" o:hrstd="t" o:hr="t" fillcolor="#a0a0a0" stroked="f"/>
+        <w:pict w14:anchorId="0B135364">
+          <v:rect id="_x0000_i1046" style="width:0;height:1.5pt" o:hralign="center" o:hrstd="t" o:hr="t" fillcolor="#a0a0a0" stroked="f"/>
         </w:pict>
       </w:r>
     </w:p>
@@ -2461,8 +2461,8 @@
     </w:p>
     <w:p>
       <w:r>
-        <w:pict w14:anchorId="1EE4CCB8">
-          <v:rect id="_x0000_i1323" style="width:0;height:1.5pt" o:hralign="center" o:hrstd="t" o:hr="t" fillcolor="#a0a0a0" stroked="f"/>
+        <w:pict w14:anchorId="0B135365">
+          <v:rect id="_x0000_i1047" style="width:0;height:1.5pt" o:hralign="center" o:hrstd="t" o:hr="t" fillcolor="#a0a0a0" stroked="f"/>
         </w:pict>
       </w:r>
     </w:p>
@@ -2618,8 +2618,8 @@
     </w:p>
     <w:p>
       <w:r>
-        <w:pict w14:anchorId="4A8E6085">
-          <v:rect id="_x0000_i1324" style="width:0;height:1.5pt" o:hralign="center" o:hrstd="t" o:hr="t" fillcolor="#a0a0a0" stroked="f"/>
+        <w:pict w14:anchorId="0B135366">
+          <v:rect id="_x0000_i1048" style="width:0;height:1.5pt" o:hralign="center" o:hrstd="t" o:hr="t" fillcolor="#a0a0a0" stroked="f"/>
         </w:pict>
       </w:r>
     </w:p>
@@ -2855,8 +2855,8 @@
     </w:p>
     <w:p>
       <w:r>
-        <w:pict w14:anchorId="5319B890">
-          <v:rect id="_x0000_i1325" style="width:0;height:1.5pt" o:hralign="center" o:hrstd="t" o:hr="t" fillcolor="#a0a0a0" stroked="f"/>
+        <w:pict w14:anchorId="0B135367">
+          <v:rect id="_x0000_i1049" style="width:0;height:1.5pt" o:hralign="center" o:hrstd="t" o:hr="t" fillcolor="#a0a0a0" stroked="f"/>
         </w:pict>
       </w:r>
     </w:p>
@@ -3831,8 +3831,8 @@
     </w:p>
     <w:p>
       <w:r>
-        <w:pict w14:anchorId="1CCA5BE2">
-          <v:rect id="_x0000_i1326" style="width:0;height:1.5pt" o:hralign="center" o:hrstd="t" o:hr="t" fillcolor="#a0a0a0" stroked="f"/>
+        <w:pict w14:anchorId="0B135368">
+          <v:rect id="_x0000_i1050" style="width:0;height:1.5pt" o:hralign="center" o:hrstd="t" o:hr="t" fillcolor="#a0a0a0" stroked="f"/>
         </w:pict>
       </w:r>
     </w:p>
@@ -3955,8 +3955,8 @@
     </w:p>
     <w:p>
       <w:r>
-        <w:pict w14:anchorId="1A33B257">
-          <v:rect id="_x0000_i1327" style="width:0;height:1.5pt" o:hralign="center" o:hrstd="t" o:hr="t" fillcolor="#a0a0a0" stroked="f"/>
+        <w:pict w14:anchorId="0B135369">
+          <v:rect id="_x0000_i1051" style="width:0;height:1.5pt" o:hralign="center" o:hrstd="t" o:hr="t" fillcolor="#a0a0a0" stroked="f"/>
         </w:pict>
       </w:r>
     </w:p>
@@ -4069,8 +4069,8 @@
     </w:p>
     <w:p>
       <w:r>
-        <w:pict w14:anchorId="4C4D60C9">
-          <v:rect id="_x0000_i1328" style="width:0;height:1.5pt" o:hralign="center" o:hrstd="t" o:hr="t" fillcolor="#a0a0a0" stroked="f"/>
+        <w:pict w14:anchorId="0B13536A">
+          <v:rect id="_x0000_i1052" style="width:0;height:1.5pt" o:hralign="center" o:hrstd="t" o:hr="t" fillcolor="#a0a0a0" stroked="f"/>
         </w:pict>
       </w:r>
     </w:p>
@@ -4205,8 +4205,8 @@
     </w:p>
     <w:p>
       <w:r>
-        <w:pict w14:anchorId="4F86ED2A">
-          <v:rect id="_x0000_i1329" style="width:0;height:1.5pt" o:hralign="center" o:hrstd="t" o:hr="t" fillcolor="#a0a0a0" stroked="f"/>
+        <w:pict w14:anchorId="0B13536B">
+          <v:rect id="_x0000_i1053" style="width:0;height:1.5pt" o:hralign="center" o:hrstd="t" o:hr="t" fillcolor="#a0a0a0" stroked="f"/>
         </w:pict>
       </w:r>
     </w:p>
@@ -4291,8 +4291,8 @@
     </w:p>
     <w:p>
       <w:r>
-        <w:pict w14:anchorId="06453E8D">
-          <v:rect id="_x0000_i1330" style="width:0;height:1.5pt" o:hralign="center" o:hrstd="t" o:hr="t" fillcolor="#a0a0a0" stroked="f"/>
+        <w:pict w14:anchorId="0B13536C">
+          <v:rect id="_x0000_i1054" style="width:0;height:1.5pt" o:hralign="center" o:hrstd="t" o:hr="t" fillcolor="#a0a0a0" stroked="f"/>
         </w:pict>
       </w:r>
     </w:p>
@@ -4355,8 +4355,8 @@
     </w:p>
     <w:p>
       <w:r>
-        <w:pict w14:anchorId="297D55FB">
-          <v:rect id="_x0000_i1331" style="width:0;height:1.5pt" o:hralign="center" o:hrstd="t" o:hr="t" fillcolor="#a0a0a0" stroked="f"/>
+        <w:pict w14:anchorId="0B13536D">
+          <v:rect id="_x0000_i1055" style="width:0;height:1.5pt" o:hralign="center" o:hrstd="t" o:hr="t" fillcolor="#a0a0a0" stroked="f"/>
         </w:pict>
       </w:r>
     </w:p>
@@ -4452,8 +4452,8 @@
     </w:p>
     <w:p>
       <w:r>
-        <w:pict w14:anchorId="48583ED9">
-          <v:rect id="_x0000_i1332" style="width:0;height:1.5pt" o:hralign="center" o:hrstd="t" o:hr="t" fillcolor="#a0a0a0" stroked="f"/>
+        <w:pict w14:anchorId="0B13536E">
+          <v:rect id="_x0000_i1056" style="width:0;height:1.5pt" o:hralign="center" o:hrstd="t" o:hr="t" fillcolor="#a0a0a0" stroked="f"/>
         </w:pict>
       </w:r>
     </w:p>
@@ -4560,8 +4560,8 @@
     </w:p>
     <w:p>
       <w:r>
-        <w:pict w14:anchorId="7C6FDB4D">
-          <v:rect id="_x0000_i1333" style="width:0;height:1.5pt" o:hralign="center" o:hrstd="t" o:hr="t" fillcolor="#a0a0a0" stroked="f"/>
+        <w:pict w14:anchorId="0B13536F">
+          <v:rect id="_x0000_i1057" style="width:0;height:1.5pt" o:hralign="center" o:hrstd="t" o:hr="t" fillcolor="#a0a0a0" stroked="f"/>
         </w:pict>
       </w:r>
     </w:p>
@@ -4702,8 +4702,8 @@
     </w:p>
     <w:p>
       <w:r>
-        <w:pict w14:anchorId="6A3D1C52">
-          <v:rect id="_x0000_i1334" style="width:0;height:1.5pt" o:hralign="center" o:hrstd="t" o:hr="t" fillcolor="#a0a0a0" stroked="f"/>
+        <w:pict w14:anchorId="0B135370">
+          <v:rect id="_x0000_i1058" style="width:0;height:1.5pt" o:hralign="center" o:hrstd="t" o:hr="t" fillcolor="#a0a0a0" stroked="f"/>
         </w:pict>
       </w:r>
     </w:p>
@@ -4816,8 +4816,8 @@
     </w:p>
     <w:p>
       <w:r>
-        <w:pict w14:anchorId="45745FAA">
-          <v:rect id="_x0000_i1335" style="width:0;height:1.5pt" o:hralign="center" o:hrstd="t" o:hr="t" fillcolor="#a0a0a0" stroked="f"/>
+        <w:pict w14:anchorId="0B135371">
+          <v:rect id="_x0000_i1059" style="width:0;height:1.5pt" o:hralign="center" o:hrstd="t" o:hr="t" fillcolor="#a0a0a0" stroked="f"/>
         </w:pict>
       </w:r>
     </w:p>
@@ -5010,8 +5010,8 @@
     </w:p>
     <w:p>
       <w:r>
-        <w:pict w14:anchorId="1C86C97D">
-          <v:rect id="_x0000_i1336" style="width:0;height:1.5pt" o:hralign="center" o:hrstd="t" o:hr="t" fillcolor="#a0a0a0" stroked="f"/>
+        <w:pict w14:anchorId="0B135372">
+          <v:rect id="_x0000_i1060" style="width:0;height:1.5pt" o:hralign="center" o:hrstd="t" o:hr="t" fillcolor="#a0a0a0" stroked="f"/>
         </w:pict>
       </w:r>
     </w:p>
@@ -5142,8 +5142,8 @@
     </w:p>
     <w:p>
       <w:r>
-        <w:pict w14:anchorId="79EC73E2">
-          <v:rect id="_x0000_i1337" style="width:0;height:1.5pt" o:hralign="center" o:hrstd="t" o:hr="t" fillcolor="#a0a0a0" stroked="f"/>
+        <w:pict w14:anchorId="0B135373">
+          <v:rect id="_x0000_i1061" style="width:0;height:1.5pt" o:hralign="center" o:hrstd="t" o:hr="t" fillcolor="#a0a0a0" stroked="f"/>
         </w:pict>
       </w:r>
     </w:p>
@@ -5341,8 +5341,8 @@
     </w:p>
     <w:p>
       <w:r>
-        <w:pict w14:anchorId="7F269D22">
-          <v:rect id="_x0000_i1338" style="width:0;height:1.5pt" o:hralign="center" o:hrstd="t" o:hr="t" fillcolor="#a0a0a0" stroked="f"/>
+        <w:pict w14:anchorId="0B135374">
+          <v:rect id="_x0000_i1062" style="width:0;height:1.5pt" o:hralign="center" o:hrstd="t" o:hr="t" fillcolor="#a0a0a0" stroked="f"/>
         </w:pict>
       </w:r>
     </w:p>
@@ -5489,8 +5489,8 @@
     </w:p>
     <w:p>
       <w:r>
-        <w:pict w14:anchorId="07672142">
-          <v:rect id="_x0000_i1339" style="width:0;height:1.5pt" o:hralign="center" o:hrstd="t" o:hr="t" fillcolor="#a0a0a0" stroked="f"/>
+        <w:pict w14:anchorId="0B135375">
+          <v:rect id="_x0000_i1063" style="width:0;height:1.5pt" o:hralign="center" o:hrstd="t" o:hr="t" fillcolor="#a0a0a0" stroked="f"/>
         </w:pict>
       </w:r>
     </w:p>
@@ -5597,8 +5597,8 @@
     </w:p>
     <w:p>
       <w:r>
-        <w:pict w14:anchorId="1A7396DA">
-          <v:rect id="_x0000_i1340" style="width:0;height:1.5pt" o:hralign="center" o:hrstd="t" o:hr="t" fillcolor="#a0a0a0" stroked="f"/>
+        <w:pict w14:anchorId="0B135376">
+          <v:rect id="_x0000_i1064" style="width:0;height:1.5pt" o:hralign="center" o:hrstd="t" o:hr="t" fillcolor="#a0a0a0" stroked="f"/>
         </w:pict>
       </w:r>
     </w:p>
@@ -5745,8 +5745,8 @@
     </w:p>
     <w:p>
       <w:r>
-        <w:pict w14:anchorId="5F6EF3AC">
-          <v:rect id="_x0000_i1341" style="width:0;height:1.5pt" o:hralign="center" o:hrstd="t" o:hr="t" fillcolor="#a0a0a0" stroked="f"/>
+        <w:pict w14:anchorId="0B135377">
+          <v:rect id="_x0000_i1065" style="width:0;height:1.5pt" o:hralign="center" o:hrstd="t" o:hr="t" fillcolor="#a0a0a0" stroked="f"/>
         </w:pict>
       </w:r>
     </w:p>
@@ -6116,8 +6116,8 @@
     </w:p>
     <w:p>
       <w:r>
-        <w:pict w14:anchorId="3E86FC74">
-          <v:rect id="_x0000_i1342" style="width:0;height:1.5pt" o:hralign="center" o:hrstd="t" o:hr="t" fillcolor="#a0a0a0" stroked="f"/>
+        <w:pict w14:anchorId="0B135378">
+          <v:rect id="_x0000_i1066" style="width:0;height:1.5pt" o:hralign="center" o:hrstd="t" o:hr="t" fillcolor="#a0a0a0" stroked="f"/>
         </w:pict>
       </w:r>
     </w:p>
@@ -6225,8 +6225,8 @@
     </w:p>
     <w:p>
       <w:r>
-        <w:pict w14:anchorId="5B8FC85A">
-          <v:rect id="_x0000_i1343" style="width:0;height:1.5pt" o:hralign="center" o:hrstd="t" o:hr="t" fillcolor="#a0a0a0" stroked="f"/>
+        <w:pict w14:anchorId="0B135379">
+          <v:rect id="_x0000_i1067" style="width:0;height:1.5pt" o:hralign="center" o:hrstd="t" o:hr="t" fillcolor="#a0a0a0" stroked="f"/>
         </w:pict>
       </w:r>
     </w:p>
@@ -6312,8 +6312,8 @@
     <w:p>
       <w:r>
         <w:lastRenderedPageBreak/>
-        <w:pict w14:anchorId="36061936">
-          <v:rect id="_x0000_i1344" style="width:0;height:1.5pt" o:hralign="center" o:hrstd="t" o:hr="t" fillcolor="#a0a0a0" stroked="f"/>
+        <w:pict w14:anchorId="0B13537A">
+          <v:rect id="_x0000_i1068" style="width:0;height:1.5pt" o:hralign="center" o:hrstd="t" o:hr="t" fillcolor="#a0a0a0" stroked="f"/>
         </w:pict>
       </w:r>
     </w:p>
@@ -6425,8 +6425,8 @@
     </w:p>
     <w:p>
       <w:r>
-        <w:pict w14:anchorId="2301F167">
-          <v:rect id="_x0000_i1345" style="width:0;height:1.5pt" o:hralign="center" o:hrstd="t" o:hr="t" fillcolor="#a0a0a0" stroked="f"/>
+        <w:pict w14:anchorId="0B13537B">
+          <v:rect id="_x0000_i1069" style="width:0;height:1.5pt" o:hralign="center" o:hrstd="t" o:hr="t" fillcolor="#a0a0a0" stroked="f"/>
         </w:pict>
       </w:r>
     </w:p>
@@ -6457,8 +6457,8 @@
     </w:p>
     <w:p>
       <w:r>
-        <w:pict w14:anchorId="1C96CC85">
-          <v:rect id="_x0000_i1346" style="width:0;height:1.5pt" o:hralign="center" o:hrstd="t" o:hr="t" fillcolor="#a0a0a0" stroked="f"/>
+        <w:pict w14:anchorId="0B13537C">
+          <v:rect id="_x0000_i1070" style="width:0;height:1.5pt" o:hralign="center" o:hrstd="t" o:hr="t" fillcolor="#a0a0a0" stroked="f"/>
         </w:pict>
       </w:r>
     </w:p>
@@ -6546,7 +6546,154 @@
         <w:t>, starting with which Python files to create first and what each one should contain.</w:t>
       </w:r>
     </w:p>
-    <w:p/>
+    <w:p>
+      <w:pPr>
+        <w:rPr>
+          <w:lang w:val="en-US"/>
+        </w:rPr>
+      </w:pPr>
+      <w:r>
+        <w:lastRenderedPageBreak/>
+        <w:drawing>
+          <wp:inline distT="0" distB="0" distL="0" distR="0" wp14:anchorId="4F05A0B8" wp14:editId="6B7555FD">
+            <wp:extent cx="5731510" cy="6348730"/>
+            <wp:effectExtent l="0" t="0" r="2540" b="0"/>
+            <wp:docPr id="1270985481" name="Picture 1"/>
+            <wp:cNvGraphicFramePr>
+              <a:graphicFrameLocks xmlns:a="http://schemas.openxmlformats.org/drawingml/2006/main" noChangeAspect="1"/>
+            </wp:cNvGraphicFramePr>
+            <a:graphic xmlns:a="http://schemas.openxmlformats.org/drawingml/2006/main">
+              <a:graphicData uri="http://schemas.openxmlformats.org/drawingml/2006/picture">
+                <pic:pic xmlns:pic="http://schemas.openxmlformats.org/drawingml/2006/picture">
+                  <pic:nvPicPr>
+                    <pic:cNvPr id="1270985481" name=""/>
+                    <pic:cNvPicPr/>
+                  </pic:nvPicPr>
+                  <pic:blipFill>
+                    <a:blip r:embed="rId5"/>
+                    <a:stretch>
+                      <a:fillRect/>
+                    </a:stretch>
+                  </pic:blipFill>
+                  <pic:spPr>
+                    <a:xfrm>
+                      <a:off x="0" y="0"/>
+                      <a:ext cx="5731510" cy="6348730"/>
+                    </a:xfrm>
+                    <a:prstGeom prst="rect">
+                      <a:avLst/>
+                    </a:prstGeom>
+                  </pic:spPr>
+                </pic:pic>
+              </a:graphicData>
+            </a:graphic>
+          </wp:inline>
+        </w:drawing>
+      </w:r>
+    </w:p>
+    <w:p>
+      <w:pPr>
+        <w:rPr>
+          <w:lang w:val="en-US"/>
+        </w:rPr>
+      </w:pPr>
+    </w:p>
+    <w:p>
+      <w:pPr>
+        <w:rPr>
+          <w:lang w:val="en-US"/>
+        </w:rPr>
+      </w:pPr>
+      <w:r>
+        <w:rPr>
+          <w:lang w:val="en-US"/>
+        </w:rPr>
+        <w:lastRenderedPageBreak/>
+        <w:drawing>
+          <wp:inline distT="0" distB="0" distL="0" distR="0" wp14:anchorId="36EA302A" wp14:editId="5A20FB2F">
+            <wp:extent cx="5731510" cy="5502910"/>
+            <wp:effectExtent l="0" t="0" r="2540" b="2540"/>
+            <wp:docPr id="340032140" name="Picture 1"/>
+            <wp:cNvGraphicFramePr>
+              <a:graphicFrameLocks xmlns:a="http://schemas.openxmlformats.org/drawingml/2006/main" noChangeAspect="1"/>
+            </wp:cNvGraphicFramePr>
+            <a:graphic xmlns:a="http://schemas.openxmlformats.org/drawingml/2006/main">
+              <a:graphicData uri="http://schemas.openxmlformats.org/drawingml/2006/picture">
+                <pic:pic xmlns:pic="http://schemas.openxmlformats.org/drawingml/2006/picture">
+                  <pic:nvPicPr>
+                    <pic:cNvPr id="340032140" name=""/>
+                    <pic:cNvPicPr/>
+                  </pic:nvPicPr>
+                  <pic:blipFill>
+                    <a:blip r:embed="rId6"/>
+                    <a:stretch>
+                      <a:fillRect/>
+                    </a:stretch>
+                  </pic:blipFill>
+                  <pic:spPr>
+                    <a:xfrm>
+                      <a:off x="0" y="0"/>
+                      <a:ext cx="5731510" cy="5502910"/>
+                    </a:xfrm>
+                    <a:prstGeom prst="rect">
+                      <a:avLst/>
+                    </a:prstGeom>
+                  </pic:spPr>
+                </pic:pic>
+              </a:graphicData>
+            </a:graphic>
+          </wp:inline>
+        </w:drawing>
+      </w:r>
+    </w:p>
+    <w:p>
+      <w:pPr>
+        <w:rPr>
+          <w:lang w:val="en-US"/>
+        </w:rPr>
+      </w:pPr>
+      <w:r>
+        <w:rPr>
+          <w:lang w:val="en-US"/>
+        </w:rPr>
+        <w:lastRenderedPageBreak/>
+        <w:drawing>
+          <wp:inline distT="0" distB="0" distL="0" distR="0" wp14:anchorId="7E060C2F" wp14:editId="5F7F572C">
+            <wp:extent cx="5731510" cy="5064760"/>
+            <wp:effectExtent l="0" t="0" r="2540" b="2540"/>
+            <wp:docPr id="161511524" name="Picture 1"/>
+            <wp:cNvGraphicFramePr>
+              <a:graphicFrameLocks xmlns:a="http://schemas.openxmlformats.org/drawingml/2006/main" noChangeAspect="1"/>
+            </wp:cNvGraphicFramePr>
+            <a:graphic xmlns:a="http://schemas.openxmlformats.org/drawingml/2006/main">
+              <a:graphicData uri="http://schemas.openxmlformats.org/drawingml/2006/picture">
+                <pic:pic xmlns:pic="http://schemas.openxmlformats.org/drawingml/2006/picture">
+                  <pic:nvPicPr>
+                    <pic:cNvPr id="161511524" name=""/>
+                    <pic:cNvPicPr/>
+                  </pic:nvPicPr>
+                  <pic:blipFill>
+                    <a:blip r:embed="rId7"/>
+                    <a:stretch>
+                      <a:fillRect/>
+                    </a:stretch>
+                  </pic:blipFill>
+                  <pic:spPr>
+                    <a:xfrm>
+                      <a:off x="0" y="0"/>
+                      <a:ext cx="5731510" cy="5064760"/>
+                    </a:xfrm>
+                    <a:prstGeom prst="rect">
+                      <a:avLst/>
+                    </a:prstGeom>
+                  </pic:spPr>
+                </pic:pic>
+              </a:graphicData>
+            </a:graphic>
+          </wp:inline>
+        </w:drawing>
+      </w:r>
+    </w:p>
     <w:sectPr>
       <w:pgSz w:w="11906" w:h="16838"/>
       <w:pgMar w:top="1440" w:right="1440" w:bottom="1440" w:left="1440" w:header="720" w:footer="720" w:gutter="0"/>
@@ -17089,6 +17236,7 @@
   <w:style w:type="character" w:default="1" w:styleId="DefaultParagraphFont">
     <w:name w:val="Default Paragraph Font"/>
     <w:uiPriority w:val="1"/>
+    <w:semiHidden/>
     <w:unhideWhenUsed/>
   </w:style>
   <w:style w:type="table" w:default="1" w:styleId="TableNormal">

</xml_diff>

<commit_message>
Improve Streamlit UI and update project files
</commit_message>
<xml_diff>
--- a/AI Medical Document Copilot.docx
+++ b/AI Medical Document Copilot.docx
@@ -6553,6 +6553,50 @@
         </w:rPr>
       </w:pPr>
       <w:r>
+        <w:rPr>
+          <w:noProof/>
+        </w:rPr>
+        <w:lastRenderedPageBreak/>
+        <w:drawing>
+          <wp:inline distT="0" distB="0" distL="0" distR="0" wp14:anchorId="265E40FB" wp14:editId="1F86AD22">
+            <wp:extent cx="5731510" cy="6348730"/>
+            <wp:effectExtent l="0" t="0" r="2540" b="0"/>
+            <wp:docPr id="1557398993" name="Picture 1"/>
+            <wp:cNvGraphicFramePr>
+              <a:graphicFrameLocks xmlns:a="http://schemas.openxmlformats.org/drawingml/2006/main" noChangeAspect="1"/>
+            </wp:cNvGraphicFramePr>
+            <a:graphic xmlns:a="http://schemas.openxmlformats.org/drawingml/2006/main">
+              <a:graphicData uri="http://schemas.openxmlformats.org/drawingml/2006/picture">
+                <pic:pic xmlns:pic="http://schemas.openxmlformats.org/drawingml/2006/picture">
+                  <pic:nvPicPr>
+                    <pic:cNvPr id="1270985481" name=""/>
+                    <pic:cNvPicPr/>
+                  </pic:nvPicPr>
+                  <pic:blipFill>
+                    <a:blip r:embed="rId5"/>
+                    <a:stretch>
+                      <a:fillRect/>
+                    </a:stretch>
+                  </pic:blipFill>
+                  <pic:spPr>
+                    <a:xfrm>
+                      <a:off x="0" y="0"/>
+                      <a:ext cx="5731510" cy="6348730"/>
+                    </a:xfrm>
+                    <a:prstGeom prst="rect">
+                      <a:avLst/>
+                    </a:prstGeom>
+                  </pic:spPr>
+                </pic:pic>
+              </a:graphicData>
+            </a:graphic>
+          </wp:inline>
+        </w:drawing>
+      </w:r>
+      <w:r>
+        <w:rPr>
+          <w:noProof/>
+        </w:rPr>
         <w:lastRenderedPageBreak/>
         <w:drawing>
           <wp:inline distT="0" distB="0" distL="0" distR="0" wp14:anchorId="4F05A0B8" wp14:editId="6B7555FD">
@@ -6606,6 +6650,7 @@
       </w:pPr>
       <w:r>
         <w:rPr>
+          <w:noProof/>
           <w:lang w:val="en-US"/>
         </w:rPr>
         <w:lastRenderedPageBreak/>
@@ -6654,6 +6699,7 @@
       </w:pPr>
       <w:r>
         <w:rPr>
+          <w:noProof/>
           <w:lang w:val="en-US"/>
         </w:rPr>
         <w:lastRenderedPageBreak/>

</xml_diff>